<commit_message>
Refactor TopicFlow and enhance user interaction with hover sound effects
- Removed the TopicFlow component and its associated slides and questions.
- Updated TAHAPAN LABORATORIUM VIRTUAL document with new practical examples and instructions.
- Added new video assets for 'Contoh Soal' in both Gaya and Gerak topics.
- Integrated hover sound functionality across various components to improve user experience.
</commit_message>
<xml_diff>
--- a/public/assets/TAHAPAN LABORATORIUM VIRTUAL.docx
+++ b/public/assets/TAHAPAN LABORATORIUM VIRTUAL.docx
@@ -171,12 +171,12 @@
           <wp:inline distB="0" distT="0" distL="0" distR="0">
             <wp:extent cx="2354982" cy="1324645"/>
             <wp:effectExtent b="0" l="0" r="0" t="0"/>
-            <wp:docPr id="31" name="image33.jpg"/>
+            <wp:docPr id="31" name="image21.jpg"/>
             <a:graphic>
               <a:graphicData uri="http://schemas.openxmlformats.org/drawingml/2006/picture">
                 <pic:pic>
                   <pic:nvPicPr>
-                    <pic:cNvPr id="0" name="image33.jpg"/>
+                    <pic:cNvPr id="0" name="image21.jpg"/>
                     <pic:cNvPicPr preferRelativeResize="0"/>
                   </pic:nvPicPr>
                   <pic:blipFill>
@@ -316,12 +316,12 @@
           <wp:inline distB="0" distT="0" distL="0" distR="0">
             <wp:extent cx="2475137" cy="1392264"/>
             <wp:effectExtent b="0" l="0" r="0" t="0"/>
-            <wp:docPr id="33" name="image19.jpg"/>
+            <wp:docPr id="33" name="image24.jpg"/>
             <a:graphic>
               <a:graphicData uri="http://schemas.openxmlformats.org/drawingml/2006/picture">
                 <pic:pic>
                   <pic:nvPicPr>
-                    <pic:cNvPr id="0" name="image19.jpg"/>
+                    <pic:cNvPr id="0" name="image24.jpg"/>
                     <pic:cNvPicPr preferRelativeResize="0"/>
                   </pic:nvPicPr>
                   <pic:blipFill>
@@ -469,12 +469,12 @@
             <wp:extent cx="262255" cy="319405"/>
             <wp:effectExtent b="0" l="0" r="0" t="0"/>
             <wp:wrapNone/>
-            <wp:docPr id="30" name="image27.png"/>
+            <wp:docPr id="30" name="image25.png"/>
             <a:graphic>
               <a:graphicData uri="http://schemas.openxmlformats.org/drawingml/2006/picture">
                 <pic:pic>
                   <pic:nvPicPr>
-                    <pic:cNvPr id="0" name="image27.png"/>
+                    <pic:cNvPr id="0" name="image25.png"/>
                     <pic:cNvPicPr preferRelativeResize="0"/>
                   </pic:nvPicPr>
                   <pic:blipFill>
@@ -511,12 +511,12 @@
             <wp:extent cx="296545" cy="290195"/>
             <wp:effectExtent b="0" l="0" r="0" t="0"/>
             <wp:wrapNone/>
-            <wp:docPr id="2" name="image5.png"/>
+            <wp:docPr id="2" name="image33.png"/>
             <a:graphic>
               <a:graphicData uri="http://schemas.openxmlformats.org/drawingml/2006/picture">
                 <pic:pic>
                   <pic:nvPicPr>
-                    <pic:cNvPr id="0" name="image5.png"/>
+                    <pic:cNvPr id="0" name="image33.png"/>
                     <pic:cNvPicPr preferRelativeResize="0"/>
                   </pic:nvPicPr>
                   <pic:blipFill>
@@ -719,12 +719,12 @@
           <wp:inline distB="0" distT="0" distL="0" distR="0">
             <wp:extent cx="2191632" cy="1232793"/>
             <wp:effectExtent b="0" l="0" r="0" t="0"/>
-            <wp:docPr id="36" name="image17.jpg"/>
+            <wp:docPr id="36" name="image26.jpg"/>
             <a:graphic>
               <a:graphicData uri="http://schemas.openxmlformats.org/drawingml/2006/picture">
                 <pic:pic>
                   <pic:nvPicPr>
-                    <pic:cNvPr id="0" name="image17.jpg"/>
+                    <pic:cNvPr id="0" name="image26.jpg"/>
                     <pic:cNvPicPr preferRelativeResize="0"/>
                   </pic:nvPicPr>
                   <pic:blipFill>
@@ -766,12 +766,12 @@
             <wp:extent cx="297180" cy="318770"/>
             <wp:effectExtent b="0" l="0" r="0" t="0"/>
             <wp:wrapNone/>
-            <wp:docPr id="39" name="image26.png"/>
+            <wp:docPr id="39" name="image30.png"/>
             <a:graphic>
               <a:graphicData uri="http://schemas.openxmlformats.org/drawingml/2006/picture">
                 <pic:pic>
                   <pic:nvPicPr>
-                    <pic:cNvPr id="0" name="image26.png"/>
+                    <pic:cNvPr id="0" name="image30.png"/>
                     <pic:cNvPicPr preferRelativeResize="0"/>
                   </pic:nvPicPr>
                   <pic:blipFill>
@@ -808,12 +808,12 @@
             <wp:extent cx="296822" cy="290285"/>
             <wp:effectExtent b="0" l="0" r="0" t="0"/>
             <wp:wrapNone/>
-            <wp:docPr id="5" name="image5.png"/>
+            <wp:docPr id="5" name="image33.png"/>
             <a:graphic>
               <a:graphicData uri="http://schemas.openxmlformats.org/drawingml/2006/picture">
                 <pic:pic>
                   <pic:nvPicPr>
-                    <pic:cNvPr id="0" name="image5.png"/>
+                    <pic:cNvPr id="0" name="image33.png"/>
                     <pic:cNvPicPr preferRelativeResize="0"/>
                   </pic:nvPicPr>
                   <pic:blipFill>
@@ -948,12 +948,12 @@
           <wp:inline distB="0" distT="0" distL="0" distR="0">
             <wp:extent cx="2166413" cy="1218577"/>
             <wp:effectExtent b="0" l="0" r="0" t="0"/>
-            <wp:docPr id="35" name="image28.jpg"/>
+            <wp:docPr id="35" name="image29.jpg"/>
             <a:graphic>
               <a:graphicData uri="http://schemas.openxmlformats.org/drawingml/2006/picture">
                 <pic:pic>
                   <pic:nvPicPr>
-                    <pic:cNvPr id="0" name="image28.jpg"/>
+                    <pic:cNvPr id="0" name="image29.jpg"/>
                     <pic:cNvPicPr preferRelativeResize="0"/>
                   </pic:nvPicPr>
                   <pic:blipFill>
@@ -1034,12 +1034,12 @@
             <wp:extent cx="271145" cy="282973"/>
             <wp:effectExtent b="0" l="0" r="0" t="0"/>
             <wp:wrapNone/>
-            <wp:docPr id="7" name="image2.png"/>
+            <wp:docPr id="7" name="image13.png"/>
             <a:graphic>
               <a:graphicData uri="http://schemas.openxmlformats.org/drawingml/2006/picture">
                 <pic:pic>
                   <pic:nvPicPr>
-                    <pic:cNvPr id="0" name="image2.png"/>
+                    <pic:cNvPr id="0" name="image13.png"/>
                     <pic:cNvPicPr preferRelativeResize="0"/>
                   </pic:nvPicPr>
                   <pic:blipFill>
@@ -1133,12 +1133,12 @@
             <wp:extent cx="608965" cy="558165"/>
             <wp:effectExtent b="0" l="0" r="0" t="0"/>
             <wp:wrapNone/>
-            <wp:docPr id="6" name="image5.png"/>
+            <wp:docPr id="6" name="image33.png"/>
             <a:graphic>
               <a:graphicData uri="http://schemas.openxmlformats.org/drawingml/2006/picture">
                 <pic:pic>
                   <pic:nvPicPr>
-                    <pic:cNvPr id="0" name="image5.png"/>
+                    <pic:cNvPr id="0" name="image33.png"/>
                     <pic:cNvPicPr preferRelativeResize="0"/>
                   </pic:nvPicPr>
                   <pic:blipFill>
@@ -1185,12 +1185,12 @@
             <wp:extent cx="608965" cy="558165"/>
             <wp:effectExtent b="0" l="0" r="0" t="0"/>
             <wp:wrapNone/>
-            <wp:docPr id="4" name="image12.png"/>
+            <wp:docPr id="4" name="image14.png"/>
             <a:graphic>
               <a:graphicData uri="http://schemas.openxmlformats.org/drawingml/2006/picture">
                 <pic:pic>
                   <pic:nvPicPr>
-                    <pic:cNvPr id="0" name="image12.png"/>
+                    <pic:cNvPr id="0" name="image14.png"/>
                     <pic:cNvPicPr preferRelativeResize="0"/>
                   </pic:nvPicPr>
                   <pic:blipFill>
@@ -1385,12 +1385,12 @@
           <wp:inline distB="0" distT="0" distL="0" distR="0">
             <wp:extent cx="2166359" cy="1218577"/>
             <wp:effectExtent b="0" l="0" r="0" t="0"/>
-            <wp:docPr id="37" name="image30.jpg"/>
+            <wp:docPr id="37" name="image27.jpg"/>
             <a:graphic>
               <a:graphicData uri="http://schemas.openxmlformats.org/drawingml/2006/picture">
                 <pic:pic>
                   <pic:nvPicPr>
-                    <pic:cNvPr id="0" name="image30.jpg"/>
+                    <pic:cNvPr id="0" name="image27.jpg"/>
                     <pic:cNvPicPr preferRelativeResize="0"/>
                   </pic:nvPicPr>
                   <pic:blipFill>
@@ -1489,12 +1489,12 @@
             <wp:extent cx="235132" cy="232917"/>
             <wp:effectExtent b="0" l="0" r="0" t="0"/>
             <wp:wrapNone/>
-            <wp:docPr id="32" name="image15.png"/>
+            <wp:docPr id="32" name="image18.png"/>
             <a:graphic>
               <a:graphicData uri="http://schemas.openxmlformats.org/drawingml/2006/picture">
                 <pic:pic>
                   <pic:nvPicPr>
-                    <pic:cNvPr id="0" name="image15.png"/>
+                    <pic:cNvPr id="0" name="image18.png"/>
                     <pic:cNvPicPr preferRelativeResize="0"/>
                   </pic:nvPicPr>
                   <pic:blipFill>
@@ -1629,12 +1629,12 @@
           <wp:inline distB="0" distT="0" distL="0" distR="0">
             <wp:extent cx="2166359" cy="1218576"/>
             <wp:effectExtent b="0" l="0" r="0" t="0"/>
-            <wp:docPr id="38" name="image32.jpg"/>
+            <wp:docPr id="38" name="image28.jpg"/>
             <a:graphic>
               <a:graphicData uri="http://schemas.openxmlformats.org/drawingml/2006/picture">
                 <pic:pic>
                   <pic:nvPicPr>
-                    <pic:cNvPr id="0" name="image32.jpg"/>
+                    <pic:cNvPr id="0" name="image28.jpg"/>
                     <pic:cNvPicPr preferRelativeResize="0"/>
                   </pic:nvPicPr>
                   <pic:blipFill>
@@ -1786,12 +1786,12 @@
             <wp:extent cx="358346" cy="337006"/>
             <wp:effectExtent b="0" l="0" r="0" t="0"/>
             <wp:wrapNone/>
-            <wp:docPr id="26" name="image22.png"/>
+            <wp:docPr id="26" name="image16.png"/>
             <a:graphic>
               <a:graphicData uri="http://schemas.openxmlformats.org/drawingml/2006/picture">
                 <pic:pic>
                   <pic:nvPicPr>
-                    <pic:cNvPr id="0" name="image22.png"/>
+                    <pic:cNvPr id="0" name="image16.png"/>
                     <pic:cNvPicPr preferRelativeResize="0"/>
                   </pic:nvPicPr>
                   <pic:blipFill>
@@ -1922,12 +1922,12 @@
           <wp:inline distB="0" distT="0" distL="0" distR="0">
             <wp:extent cx="2475137" cy="1392264"/>
             <wp:effectExtent b="0" l="0" r="0" t="0"/>
-            <wp:docPr id="40" name="image21.jpg"/>
+            <wp:docPr id="40" name="image32.jpg"/>
             <a:graphic>
               <a:graphicData uri="http://schemas.openxmlformats.org/drawingml/2006/picture">
                 <pic:pic>
                   <pic:nvPicPr>
-                    <pic:cNvPr id="0" name="image21.jpg"/>
+                    <pic:cNvPr id="0" name="image32.jpg"/>
                     <pic:cNvPicPr preferRelativeResize="0"/>
                   </pic:nvPicPr>
                   <pic:blipFill>
@@ -1969,12 +1969,12 @@
             <wp:extent cx="358346" cy="334349"/>
             <wp:effectExtent b="0" l="0" r="0" t="0"/>
             <wp:wrapNone/>
-            <wp:docPr id="16" name="image24.png"/>
+            <wp:docPr id="16" name="image7.png"/>
             <a:graphic>
               <a:graphicData uri="http://schemas.openxmlformats.org/drawingml/2006/picture">
                 <pic:pic>
                   <pic:nvPicPr>
-                    <pic:cNvPr id="0" name="image24.png"/>
+                    <pic:cNvPr id="0" name="image7.png"/>
                     <pic:cNvPicPr preferRelativeResize="0"/>
                   </pic:nvPicPr>
                   <pic:blipFill>
@@ -2105,12 +2105,12 @@
           <wp:inline distB="0" distT="0" distL="0" distR="0">
             <wp:extent cx="2475136" cy="1392264"/>
             <wp:effectExtent b="0" l="0" r="0" t="0"/>
-            <wp:docPr id="41" name="image36.jpg"/>
+            <wp:docPr id="41" name="image31.jpg"/>
             <a:graphic>
               <a:graphicData uri="http://schemas.openxmlformats.org/drawingml/2006/picture">
                 <pic:pic>
                   <pic:nvPicPr>
-                    <pic:cNvPr id="0" name="image36.jpg"/>
+                    <pic:cNvPr id="0" name="image31.jpg"/>
                     <pic:cNvPicPr preferRelativeResize="0"/>
                   </pic:nvPicPr>
                   <pic:blipFill>
@@ -2246,12 +2246,12 @@
           <wp:inline distB="0" distT="0" distL="0" distR="0">
             <wp:extent cx="2475136" cy="1392264"/>
             <wp:effectExtent b="0" l="0" r="0" t="0"/>
-            <wp:docPr id="42" name="image25.jpg"/>
+            <wp:docPr id="42" name="image36.jpg"/>
             <a:graphic>
               <a:graphicData uri="http://schemas.openxmlformats.org/drawingml/2006/picture">
                 <pic:pic>
                   <pic:nvPicPr>
-                    <pic:cNvPr id="0" name="image25.jpg"/>
+                    <pic:cNvPr id="0" name="image36.jpg"/>
                     <pic:cNvPicPr preferRelativeResize="0"/>
                   </pic:nvPicPr>
                   <pic:blipFill>
@@ -2391,12 +2391,12 @@
           <wp:inline distB="0" distT="0" distL="0" distR="0">
             <wp:extent cx="2166359" cy="1218576"/>
             <wp:effectExtent b="0" l="0" r="0" t="0"/>
-            <wp:docPr id="19" name="image10.jpg"/>
+            <wp:docPr id="19" name="image12.jpg"/>
             <a:graphic>
               <a:graphicData uri="http://schemas.openxmlformats.org/drawingml/2006/picture">
                 <pic:pic>
                   <pic:nvPicPr>
-                    <pic:cNvPr id="0" name="image10.jpg"/>
+                    <pic:cNvPr id="0" name="image12.jpg"/>
                     <pic:cNvPicPr preferRelativeResize="0"/>
                   </pic:nvPicPr>
                   <pic:blipFill>
@@ -2459,12 +2459,12 @@
           <wp:inline distB="0" distT="0" distL="0" distR="0">
             <wp:extent cx="2166357" cy="1218576"/>
             <wp:effectExtent b="0" l="0" r="0" t="0"/>
-            <wp:docPr id="20" name="image14.jpg"/>
+            <wp:docPr id="20" name="image3.jpg"/>
             <a:graphic>
               <a:graphicData uri="http://schemas.openxmlformats.org/drawingml/2006/picture">
                 <pic:pic>
                   <pic:nvPicPr>
-                    <pic:cNvPr id="0" name="image14.jpg"/>
+                    <pic:cNvPr id="0" name="image3.jpg"/>
                     <pic:cNvPicPr preferRelativeResize="0"/>
                   </pic:nvPicPr>
                   <pic:blipFill>
@@ -2604,12 +2604,12 @@
           <wp:inline distB="0" distT="0" distL="0" distR="0">
             <wp:extent cx="2166357" cy="1218576"/>
             <wp:effectExtent b="0" l="0" r="0" t="0"/>
-            <wp:docPr id="21" name="image18.jpg"/>
+            <wp:docPr id="21" name="image10.jpg"/>
             <a:graphic>
               <a:graphicData uri="http://schemas.openxmlformats.org/drawingml/2006/picture">
                 <pic:pic>
                   <pic:nvPicPr>
-                    <pic:cNvPr id="0" name="image18.jpg"/>
+                    <pic:cNvPr id="0" name="image10.jpg"/>
                     <pic:cNvPicPr preferRelativeResize="0"/>
                   </pic:nvPicPr>
                   <pic:blipFill>
@@ -2811,12 +2811,12 @@
           <wp:inline distB="0" distT="0" distL="0" distR="0">
             <wp:extent cx="2166357" cy="1218576"/>
             <wp:effectExtent b="0" l="0" r="0" t="0"/>
-            <wp:docPr id="22" name="image4.jpg"/>
+            <wp:docPr id="22" name="image19.jpg"/>
             <a:graphic>
               <a:graphicData uri="http://schemas.openxmlformats.org/drawingml/2006/picture">
                 <pic:pic>
                   <pic:nvPicPr>
-                    <pic:cNvPr id="0" name="image4.jpg"/>
+                    <pic:cNvPr id="0" name="image19.jpg"/>
                     <pic:cNvPicPr preferRelativeResize="0"/>
                   </pic:nvPicPr>
                   <pic:blipFill>
@@ -3024,12 +3024,12 @@
           <wp:inline distB="0" distT="0" distL="0" distR="0">
             <wp:extent cx="1943006" cy="1092941"/>
             <wp:effectExtent b="0" l="0" r="0" t="0"/>
-            <wp:docPr id="24" name="image13.jpg"/>
+            <wp:docPr id="24" name="image17.jpg"/>
             <a:graphic>
               <a:graphicData uri="http://schemas.openxmlformats.org/drawingml/2006/picture">
                 <pic:pic>
                   <pic:nvPicPr>
-                    <pic:cNvPr id="0" name="image13.jpg"/>
+                    <pic:cNvPr id="0" name="image17.jpg"/>
                     <pic:cNvPicPr preferRelativeResize="0"/>
                   </pic:nvPicPr>
                   <pic:blipFill>
@@ -3113,7 +3113,45 @@
           <w:vertAlign w:val="baseline"/>
           <w:rtl w:val="0"/>
         </w:rPr>
-        <w:t xml:space="preserve">Setelah materi langsung praktikum gerak</w:t>
+        <w:t xml:space="preserve">Setelah materi </w:t>
+      </w:r>
+      <w:r>
+        <w:rPr>
+          <w:rtl w:val="0"/>
+        </w:rPr>
+        <w:t xml:space="preserve">ada contoh soal yang video lalu masuk ke praktikum</w:t>
+      </w:r>
+    </w:p>
+    <w:p>
+      <w:pPr>
+        <w:keepNext w:val="0"/>
+        <w:keepLines w:val="0"/>
+        <w:pageBreakBefore w:val="0"/>
+        <w:widowControl w:val="1"/>
+        <w:numPr>
+          <w:ilvl w:val="0"/>
+          <w:numId w:val="3"/>
+        </w:numPr>
+        <w:pBdr>
+          <w:top w:space="0" w:sz="0" w:val="nil"/>
+          <w:left w:space="0" w:sz="0" w:val="nil"/>
+          <w:bottom w:space="0" w:sz="0" w:val="nil"/>
+          <w:right w:space="0" w:sz="0" w:val="nil"/>
+          <w:between w:space="0" w:sz="0" w:val="nil"/>
+        </w:pBdr>
+        <w:shd w:fill="auto" w:val="clear"/>
+        <w:spacing w:after="0" w:before="0" w:line="278.00000000000006" w:lineRule="auto"/>
+        <w:ind w:left="2421" w:right="0" w:hanging="360"/>
+        <w:jc w:val="left"/>
+        <w:rPr>
+          <w:u w:val="none"/>
+        </w:rPr>
+      </w:pPr>
+      <w:r>
+        <w:rPr>
+          <w:rtl w:val="0"/>
+        </w:rPr>
+        <w:t xml:space="preserve">Praktikum</w:t>
       </w:r>
     </w:p>
     <w:p>
@@ -3206,7 +3244,267 @@
           <w:vertAlign w:val="baseline"/>
           <w:rtl w:val="0"/>
         </w:rPr>
-        <w:t xml:space="preserve">  (Detik ke 0:30-2:30) “orang” diubah jadi (mobil)</w:t>
+        <w:t xml:space="preserve">  (Detik ke 0:30-2:30) </w:t>
+      </w:r>
+    </w:p>
+    <w:p>
+      <w:pPr>
+        <w:keepNext w:val="0"/>
+        <w:keepLines w:val="0"/>
+        <w:pageBreakBefore w:val="0"/>
+        <w:widowControl w:val="1"/>
+        <w:pBdr>
+          <w:top w:space="0" w:sz="0" w:val="nil"/>
+          <w:left w:space="0" w:sz="0" w:val="nil"/>
+          <w:bottom w:space="0" w:sz="0" w:val="nil"/>
+          <w:right w:space="0" w:sz="0" w:val="nil"/>
+          <w:between w:space="0" w:sz="0" w:val="nil"/>
+        </w:pBdr>
+        <w:shd w:fill="auto" w:val="clear"/>
+        <w:spacing w:after="0" w:before="0" w:line="278.00000000000006" w:lineRule="auto"/>
+        <w:ind w:left="2421" w:right="0" w:firstLine="0"/>
+        <w:jc w:val="left"/>
+        <w:rPr>
+          <w:rFonts w:ascii="Calibri" w:cs="Calibri" w:eastAsia="Calibri" w:hAnsi="Calibri"/>
+          <w:b w:val="0"/>
+          <w:bCs w:val="0"/>
+          <w:i w:val="0"/>
+          <w:iCs w:val="0"/>
+          <w:smallCaps w:val="0"/>
+          <w:strike w:val="0"/>
+          <w:color w:val="000000"/>
+          <w:sz w:val="24"/>
+          <w:szCs w:val="24"/>
+          <w:u w:val="none"/>
+          <w:shd w:fill="auto" w:val="clear"/>
+          <w:vertAlign w:val="baseline"/>
+        </w:rPr>
+      </w:pPr>
+      <w:r>
+        <w:rPr>
+          <w:rFonts w:ascii="Calibri" w:cs="Calibri" w:eastAsia="Calibri" w:hAnsi="Calibri"/>
+          <w:b w:val="0"/>
+          <w:bCs w:val="0"/>
+          <w:i w:val="0"/>
+          <w:iCs w:val="0"/>
+          <w:smallCaps w:val="0"/>
+          <w:strike w:val="0"/>
+          <w:color w:val="000000"/>
+          <w:sz w:val="24"/>
+          <w:szCs w:val="24"/>
+          <w:u w:val="none"/>
+          <w:shd w:fill="auto" w:val="clear"/>
+          <w:vertAlign w:val="baseline"/>
+          <w:rtl w:val="0"/>
+        </w:rPr>
+        <w:t xml:space="preserve">“orang” diubah jadi (mobil) yang menuju kerumah</w:t>
+      </w:r>
+    </w:p>
+    <w:p>
+      <w:pPr>
+        <w:keepNext w:val="0"/>
+        <w:keepLines w:val="0"/>
+        <w:pageBreakBefore w:val="0"/>
+        <w:widowControl w:val="1"/>
+        <w:pBdr>
+          <w:top w:space="0" w:sz="0" w:val="nil"/>
+          <w:left w:space="0" w:sz="0" w:val="nil"/>
+          <w:bottom w:space="0" w:sz="0" w:val="nil"/>
+          <w:right w:space="0" w:sz="0" w:val="nil"/>
+          <w:between w:space="0" w:sz="0" w:val="nil"/>
+        </w:pBdr>
+        <w:shd w:fill="auto" w:val="clear"/>
+        <w:spacing w:after="0" w:before="0" w:line="278.00000000000006" w:lineRule="auto"/>
+        <w:ind w:left="2421" w:right="0" w:firstLine="0"/>
+        <w:jc w:val="left"/>
+        <w:rPr/>
+      </w:pPr>
+      <w:r>
+        <w:rPr>
+          <w:rtl w:val="0"/>
+        </w:rPr>
+        <w:t xml:space="preserve">sediakan sesuai praktikum di video, buat agar biar disetel bebas berapa saja</w:t>
+      </w:r>
+    </w:p>
+    <w:p>
+      <w:pPr>
+        <w:keepNext w:val="0"/>
+        <w:keepLines w:val="0"/>
+        <w:pageBreakBefore w:val="0"/>
+        <w:widowControl w:val="1"/>
+        <w:pBdr>
+          <w:top w:space="0" w:sz="0" w:val="nil"/>
+          <w:left w:space="0" w:sz="0" w:val="nil"/>
+          <w:bottom w:space="0" w:sz="0" w:val="nil"/>
+          <w:right w:space="0" w:sz="0" w:val="nil"/>
+          <w:between w:space="0" w:sz="0" w:val="nil"/>
+        </w:pBdr>
+        <w:shd w:fill="auto" w:val="clear"/>
+        <w:spacing w:after="0" w:before="0" w:line="278.00000000000006" w:lineRule="auto"/>
+        <w:ind w:left="2421" w:right="0" w:firstLine="0"/>
+        <w:jc w:val="left"/>
+        <w:rPr/>
+      </w:pPr>
+      <w:r>
+        <w:rPr>
+          <w:rtl w:val="0"/>
+        </w:rPr>
+        <w:t xml:space="preserve">rumusnya sesuai tabel itu s = v . t </w:t>
+      </w:r>
+    </w:p>
+    <w:p>
+      <w:pPr>
+        <w:keepNext w:val="0"/>
+        <w:keepLines w:val="0"/>
+        <w:pageBreakBefore w:val="0"/>
+        <w:widowControl w:val="1"/>
+        <w:pBdr>
+          <w:top w:space="0" w:sz="0" w:val="nil"/>
+          <w:left w:space="0" w:sz="0" w:val="nil"/>
+          <w:bottom w:space="0" w:sz="0" w:val="nil"/>
+          <w:right w:space="0" w:sz="0" w:val="nil"/>
+          <w:between w:space="0" w:sz="0" w:val="nil"/>
+        </w:pBdr>
+        <w:shd w:fill="auto" w:val="clear"/>
+        <w:spacing w:after="0" w:before="0" w:line="278.00000000000006" w:lineRule="auto"/>
+        <w:ind w:left="2421" w:right="0" w:firstLine="0"/>
+        <w:jc w:val="left"/>
+        <w:rPr/>
+      </w:pPr>
+      <w:r>
+        <w:rPr>
+          <w:rtl w:val="0"/>
+        </w:rPr>
+        <w:t xml:space="preserve">dimana </w:t>
+      </w:r>
+    </w:p>
+    <w:p>
+      <w:pPr>
+        <w:keepNext w:val="0"/>
+        <w:keepLines w:val="0"/>
+        <w:pageBreakBefore w:val="0"/>
+        <w:widowControl w:val="1"/>
+        <w:pBdr>
+          <w:top w:space="0" w:sz="0" w:val="nil"/>
+          <w:left w:space="0" w:sz="0" w:val="nil"/>
+          <w:bottom w:space="0" w:sz="0" w:val="nil"/>
+          <w:right w:space="0" w:sz="0" w:val="nil"/>
+          <w:between w:space="0" w:sz="0" w:val="nil"/>
+        </w:pBdr>
+        <w:shd w:fill="auto" w:val="clear"/>
+        <w:spacing w:after="0" w:before="0" w:line="278.00000000000006" w:lineRule="auto"/>
+        <w:ind w:left="2421" w:right="0" w:firstLine="0"/>
+        <w:jc w:val="left"/>
+        <w:rPr/>
+      </w:pPr>
+      <w:r>
+        <w:rPr>
+          <w:rtl w:val="0"/>
+        </w:rPr>
+        <w:t xml:space="preserve">s = jarak satuan meter(m)</w:t>
+      </w:r>
+    </w:p>
+    <w:p>
+      <w:pPr>
+        <w:keepNext w:val="0"/>
+        <w:keepLines w:val="0"/>
+        <w:pageBreakBefore w:val="0"/>
+        <w:widowControl w:val="1"/>
+        <w:pBdr>
+          <w:top w:space="0" w:sz="0" w:val="nil"/>
+          <w:left w:space="0" w:sz="0" w:val="nil"/>
+          <w:bottom w:space="0" w:sz="0" w:val="nil"/>
+          <w:right w:space="0" w:sz="0" w:val="nil"/>
+          <w:between w:space="0" w:sz="0" w:val="nil"/>
+        </w:pBdr>
+        <w:shd w:fill="auto" w:val="clear"/>
+        <w:spacing w:after="0" w:before="0" w:line="278.00000000000006" w:lineRule="auto"/>
+        <w:ind w:left="2421" w:right="0" w:firstLine="0"/>
+        <w:jc w:val="left"/>
+        <w:rPr/>
+      </w:pPr>
+      <w:r>
+        <w:rPr>
+          <w:rtl w:val="0"/>
+        </w:rPr>
+        <w:t xml:space="preserve">v = kecepatan satuan (m/s)</w:t>
+      </w:r>
+    </w:p>
+    <w:p>
+      <w:pPr>
+        <w:keepNext w:val="0"/>
+        <w:keepLines w:val="0"/>
+        <w:pageBreakBefore w:val="0"/>
+        <w:widowControl w:val="1"/>
+        <w:pBdr>
+          <w:top w:space="0" w:sz="0" w:val="nil"/>
+          <w:left w:space="0" w:sz="0" w:val="nil"/>
+          <w:bottom w:space="0" w:sz="0" w:val="nil"/>
+          <w:right w:space="0" w:sz="0" w:val="nil"/>
+          <w:between w:space="0" w:sz="0" w:val="nil"/>
+        </w:pBdr>
+        <w:shd w:fill="auto" w:val="clear"/>
+        <w:spacing w:after="0" w:before="0" w:line="278.00000000000006" w:lineRule="auto"/>
+        <w:ind w:left="2421" w:right="0" w:firstLine="0"/>
+        <w:jc w:val="left"/>
+        <w:rPr/>
+      </w:pPr>
+      <w:r>
+        <w:rPr>
+          <w:rtl w:val="0"/>
+        </w:rPr>
+        <w:t xml:space="preserve">t = waktu satuan s (sekon/detik)</w:t>
+      </w:r>
+    </w:p>
+    <w:p>
+      <w:pPr>
+        <w:keepNext w:val="0"/>
+        <w:keepLines w:val="0"/>
+        <w:pageBreakBefore w:val="0"/>
+        <w:widowControl w:val="1"/>
+        <w:pBdr>
+          <w:top w:space="0" w:sz="0" w:val="nil"/>
+          <w:left w:space="0" w:sz="0" w:val="nil"/>
+          <w:bottom w:space="0" w:sz="0" w:val="nil"/>
+          <w:right w:space="0" w:sz="0" w:val="nil"/>
+          <w:between w:space="0" w:sz="0" w:val="nil"/>
+        </w:pBdr>
+        <w:shd w:fill="auto" w:val="clear"/>
+        <w:spacing w:after="0" w:before="0" w:line="278.00000000000006" w:lineRule="auto"/>
+        <w:ind w:left="2421" w:right="0" w:firstLine="0"/>
+        <w:jc w:val="left"/>
+        <w:rPr/>
+      </w:pPr>
+      <w:r>
+        <w:rPr>
+          <w:rtl w:val="0"/>
+        </w:rPr>
+        <w:t xml:space="preserve">untuk waktu itu berjalan ketika dijalankan dan sudah dimasukan kecepatan yang ingin diukur jaraknya. setelah selesai sediakan tombol ulangin agar angka yg pertama kembali 0 atau kembali ke awal. </w:t>
+      </w:r>
+    </w:p>
+    <w:p>
+      <w:pPr>
+        <w:keepNext w:val="0"/>
+        <w:keepLines w:val="0"/>
+        <w:pageBreakBefore w:val="0"/>
+        <w:widowControl w:val="1"/>
+        <w:pBdr>
+          <w:top w:space="0" w:sz="0" w:val="nil"/>
+          <w:left w:space="0" w:sz="0" w:val="nil"/>
+          <w:bottom w:space="0" w:sz="0" w:val="nil"/>
+          <w:right w:space="0" w:sz="0" w:val="nil"/>
+          <w:between w:space="0" w:sz="0" w:val="nil"/>
+        </w:pBdr>
+        <w:shd w:fill="auto" w:val="clear"/>
+        <w:spacing w:after="0" w:before="0" w:line="278.00000000000006" w:lineRule="auto"/>
+        <w:ind w:left="2421" w:right="0" w:firstLine="0"/>
+        <w:jc w:val="left"/>
+        <w:rPr/>
+      </w:pPr>
+      <w:r>
+        <w:rPr>
+          <w:rtl w:val="0"/>
+        </w:rPr>
       </w:r>
     </w:p>
     <w:p>
@@ -3319,12 +3617,12 @@
           <wp:inline distB="0" distT="0" distL="0" distR="0">
             <wp:extent cx="1927624" cy="1084288"/>
             <wp:effectExtent b="0" l="0" r="0" t="0"/>
-            <wp:docPr id="25" name="image11.jpg"/>
+            <wp:docPr id="25" name="image20.jpg"/>
             <a:graphic>
               <a:graphicData uri="http://schemas.openxmlformats.org/drawingml/2006/picture">
                 <pic:pic>
                   <pic:nvPicPr>
-                    <pic:cNvPr id="0" name="image11.jpg"/>
+                    <pic:cNvPr id="0" name="image20.jpg"/>
                     <pic:cNvPicPr preferRelativeResize="0"/>
                   </pic:nvPicPr>
                   <pic:blipFill>
@@ -3387,12 +3685,12 @@
           <wp:inline distB="0" distT="0" distL="0" distR="0">
             <wp:extent cx="1943006" cy="1092940"/>
             <wp:effectExtent b="0" l="0" r="0" t="0"/>
-            <wp:docPr id="27" name="image20.jpg"/>
+            <wp:docPr id="27" name="image22.jpg"/>
             <a:graphic>
               <a:graphicData uri="http://schemas.openxmlformats.org/drawingml/2006/picture">
                 <pic:pic>
                   <pic:nvPicPr>
-                    <pic:cNvPr id="0" name="image20.jpg"/>
+                    <pic:cNvPr id="0" name="image22.jpg"/>
                     <pic:cNvPicPr preferRelativeResize="0"/>
                   </pic:nvPicPr>
                   <pic:blipFill>
@@ -3532,12 +3830,12 @@
           <wp:inline distB="0" distT="0" distL="0" distR="0">
             <wp:extent cx="2475136" cy="1392264"/>
             <wp:effectExtent b="0" l="0" r="0" t="0"/>
-            <wp:docPr id="28" name="image16.jpg"/>
+            <wp:docPr id="28" name="image23.jpg"/>
             <a:graphic>
               <a:graphicData uri="http://schemas.openxmlformats.org/drawingml/2006/picture">
                 <pic:pic>
                   <pic:nvPicPr>
-                    <pic:cNvPr id="0" name="image16.jpg"/>
+                    <pic:cNvPr id="0" name="image23.jpg"/>
                     <pic:cNvPicPr preferRelativeResize="0"/>
                   </pic:nvPicPr>
                   <pic:blipFill>
@@ -3620,12 +3918,12 @@
           <wp:inline distB="0" distT="0" distL="0" distR="0">
             <wp:extent cx="2013258" cy="1132457"/>
             <wp:effectExtent b="0" l="0" r="0" t="0"/>
-            <wp:docPr id="29" name="image31.jpg"/>
+            <wp:docPr id="29" name="image4.jpg"/>
             <a:graphic>
               <a:graphicData uri="http://schemas.openxmlformats.org/drawingml/2006/picture">
                 <pic:pic>
                   <pic:nvPicPr>
-                    <pic:cNvPr id="0" name="image31.jpg"/>
+                    <pic:cNvPr id="0" name="image4.jpg"/>
                     <pic:cNvPicPr preferRelativeResize="0"/>
                   </pic:nvPicPr>
                   <pic:blipFill>
@@ -3688,12 +3986,12 @@
           <wp:inline distB="0" distT="0" distL="0" distR="0">
             <wp:extent cx="2009902" cy="1130570"/>
             <wp:effectExtent b="0" l="0" r="0" t="0"/>
-            <wp:docPr id="8" name="image8.jpg"/>
+            <wp:docPr id="8" name="image9.jpg"/>
             <a:graphic>
               <a:graphicData uri="http://schemas.openxmlformats.org/drawingml/2006/picture">
                 <pic:pic>
                   <pic:nvPicPr>
-                    <pic:cNvPr id="0" name="image8.jpg"/>
+                    <pic:cNvPr id="0" name="image9.jpg"/>
                     <pic:cNvPicPr preferRelativeResize="0"/>
                   </pic:nvPicPr>
                   <pic:blipFill>
@@ -3909,12 +4207,12 @@
           <wp:inline distB="0" distT="0" distL="0" distR="0">
             <wp:extent cx="2475136" cy="1392264"/>
             <wp:effectExtent b="0" l="0" r="0" t="0"/>
-            <wp:docPr id="9" name="image1.jpg"/>
+            <wp:docPr id="9" name="image15.jpg"/>
             <a:graphic>
               <a:graphicData uri="http://schemas.openxmlformats.org/drawingml/2006/picture">
                 <pic:pic>
                   <pic:nvPicPr>
-                    <pic:cNvPr id="0" name="image1.jpg"/>
+                    <pic:cNvPr id="0" name="image15.jpg"/>
                     <pic:cNvPicPr preferRelativeResize="0"/>
                   </pic:nvPicPr>
                   <pic:blipFill>
@@ -4054,12 +4352,12 @@
           <wp:inline distB="0" distT="0" distL="0" distR="0">
             <wp:extent cx="2166357" cy="1218576"/>
             <wp:effectExtent b="0" l="0" r="0" t="0"/>
-            <wp:docPr id="10" name="image18.jpg"/>
+            <wp:docPr id="10" name="image10.jpg"/>
             <a:graphic>
               <a:graphicData uri="http://schemas.openxmlformats.org/drawingml/2006/picture">
                 <pic:pic>
                   <pic:nvPicPr>
-                    <pic:cNvPr id="0" name="image18.jpg"/>
+                    <pic:cNvPr id="0" name="image10.jpg"/>
                     <pic:cNvPicPr preferRelativeResize="0"/>
                   </pic:nvPicPr>
                   <pic:blipFill>
@@ -4261,12 +4559,12 @@
           <wp:inline distB="0" distT="0" distL="0" distR="0">
             <wp:extent cx="2166357" cy="1218575"/>
             <wp:effectExtent b="0" l="0" r="0" t="0"/>
-            <wp:docPr id="11" name="image6.jpg"/>
+            <wp:docPr id="11" name="image1.jpg"/>
             <a:graphic>
               <a:graphicData uri="http://schemas.openxmlformats.org/drawingml/2006/picture">
                 <pic:pic>
                   <pic:nvPicPr>
-                    <pic:cNvPr id="0" name="image6.jpg"/>
+                    <pic:cNvPr id="0" name="image1.jpg"/>
                     <pic:cNvPicPr preferRelativeResize="0"/>
                   </pic:nvPicPr>
                   <pic:blipFill>
@@ -4406,12 +4704,12 @@
           <wp:inline distB="0" distT="0" distL="0" distR="0">
             <wp:extent cx="1927624" cy="1084288"/>
             <wp:effectExtent b="0" l="0" r="0" t="0"/>
-            <wp:docPr id="12" name="image9.jpg"/>
+            <wp:docPr id="12" name="image6.jpg"/>
             <a:graphic>
               <a:graphicData uri="http://schemas.openxmlformats.org/drawingml/2006/picture">
                 <pic:pic>
                   <pic:nvPicPr>
-                    <pic:cNvPr id="0" name="image9.jpg"/>
+                    <pic:cNvPr id="0" name="image6.jpg"/>
                     <pic:cNvPicPr preferRelativeResize="0"/>
                   </pic:nvPicPr>
                   <pic:blipFill>
@@ -4474,12 +4772,12 @@
           <wp:inline distB="0" distT="0" distL="0" distR="0">
             <wp:extent cx="1943006" cy="1092940"/>
             <wp:effectExtent b="0" l="0" r="0" t="0"/>
-            <wp:docPr id="13" name="image29.jpg"/>
+            <wp:docPr id="13" name="image2.jpg"/>
             <a:graphic>
               <a:graphicData uri="http://schemas.openxmlformats.org/drawingml/2006/picture">
                 <pic:pic>
                   <pic:nvPicPr>
-                    <pic:cNvPr id="0" name="image29.jpg"/>
+                    <pic:cNvPr id="0" name="image2.jpg"/>
                     <pic:cNvPicPr preferRelativeResize="0"/>
                   </pic:nvPicPr>
                   <pic:blipFill>
@@ -4563,7 +4861,45 @@
           <w:vertAlign w:val="baseline"/>
           <w:rtl w:val="0"/>
         </w:rPr>
-        <w:t xml:space="preserve">Setelah materi langsung praktikum gaya</w:t>
+        <w:t xml:space="preserve">Setelah materi </w:t>
+      </w:r>
+      <w:r>
+        <w:rPr>
+          <w:rtl w:val="0"/>
+        </w:rPr>
+        <w:t xml:space="preserve">Setelah materi ada contoh soal yang video lalu masuk ke praktikum</w:t>
+      </w:r>
+    </w:p>
+    <w:p>
+      <w:pPr>
+        <w:keepNext w:val="0"/>
+        <w:keepLines w:val="0"/>
+        <w:pageBreakBefore w:val="0"/>
+        <w:widowControl w:val="1"/>
+        <w:numPr>
+          <w:ilvl w:val="0"/>
+          <w:numId w:val="2"/>
+        </w:numPr>
+        <w:pBdr>
+          <w:top w:space="0" w:sz="0" w:val="nil"/>
+          <w:left w:space="0" w:sz="0" w:val="nil"/>
+          <w:bottom w:space="0" w:sz="0" w:val="nil"/>
+          <w:right w:space="0" w:sz="0" w:val="nil"/>
+          <w:between w:space="0" w:sz="0" w:val="nil"/>
+        </w:pBdr>
+        <w:shd w:fill="auto" w:val="clear"/>
+        <w:spacing w:after="0" w:before="0" w:line="278.00000000000006" w:lineRule="auto"/>
+        <w:ind w:left="2520" w:right="0" w:hanging="360"/>
+        <w:jc w:val="left"/>
+        <w:rPr>
+          <w:u w:val="none"/>
+        </w:rPr>
+      </w:pPr>
+      <w:r>
+        <w:rPr>
+          <w:rtl w:val="0"/>
+        </w:rPr>
+        <w:t xml:space="preserve">Praktikum</w:t>
       </w:r>
     </w:p>
     <w:p>
@@ -4665,6 +5001,57 @@
         <w:keepLines w:val="0"/>
         <w:pageBreakBefore w:val="0"/>
         <w:widowControl w:val="1"/>
+        <w:pBdr>
+          <w:top w:space="0" w:sz="0" w:val="nil"/>
+          <w:left w:space="0" w:sz="0" w:val="nil"/>
+          <w:bottom w:space="0" w:sz="0" w:val="nil"/>
+          <w:right w:space="0" w:sz="0" w:val="nil"/>
+          <w:between w:space="0" w:sz="0" w:val="nil"/>
+        </w:pBdr>
+        <w:shd w:fill="auto" w:val="clear"/>
+        <w:spacing w:after="0" w:before="0" w:line="278.00000000000006" w:lineRule="auto"/>
+        <w:ind w:left="2421" w:right="0" w:firstLine="0"/>
+        <w:jc w:val="left"/>
+        <w:rPr/>
+      </w:pPr>
+      <w:r>
+        <w:rPr>
+          <w:rtl w:val="0"/>
+        </w:rPr>
+        <w:t xml:space="preserve">samakan seperti di referensi orang mendorong beban dengan massa beban berbeda” (elemen beban sudah ada didrive ada “beban 20kg, 35kg, 50kg, 125kg. dan gaya bisa disetel seperti referensi ada ukuran 50N, 100, 150, 200, 250, 300, 350, dan 400 nantik tabel menyesuaikan bebas pilihan untuk soal lainnya. ditanya percepatannya dengan rumus F=m.a </w:t>
+      </w:r>
+    </w:p>
+    <w:p>
+      <w:pPr>
+        <w:keepNext w:val="0"/>
+        <w:keepLines w:val="0"/>
+        <w:pageBreakBefore w:val="0"/>
+        <w:widowControl w:val="1"/>
+        <w:pBdr>
+          <w:top w:space="0" w:sz="0" w:val="nil"/>
+          <w:left w:space="0" w:sz="0" w:val="nil"/>
+          <w:bottom w:space="0" w:sz="0" w:val="nil"/>
+          <w:right w:space="0" w:sz="0" w:val="nil"/>
+          <w:between w:space="0" w:sz="0" w:val="nil"/>
+        </w:pBdr>
+        <w:shd w:fill="auto" w:val="clear"/>
+        <w:spacing w:after="0" w:before="0" w:line="278.00000000000006" w:lineRule="auto"/>
+        <w:ind w:left="2421" w:right="0" w:firstLine="0"/>
+        <w:jc w:val="left"/>
+        <w:rPr/>
+      </w:pPr>
+      <w:r>
+        <w:rPr>
+          <w:rtl w:val="0"/>
+        </w:rPr>
+      </w:r>
+    </w:p>
+    <w:p>
+      <w:pPr>
+        <w:keepNext w:val="0"/>
+        <w:keepLines w:val="0"/>
+        <w:pageBreakBefore w:val="0"/>
+        <w:widowControl w:val="1"/>
         <w:numPr>
           <w:ilvl w:val="0"/>
           <w:numId w:val="2"/>
@@ -4769,12 +5156,12 @@
           <wp:inline distB="0" distT="0" distL="0" distR="0">
             <wp:extent cx="1927623" cy="1084288"/>
             <wp:effectExtent b="0" l="0" r="0" t="0"/>
-            <wp:docPr id="14" name="image7.jpg"/>
+            <wp:docPr id="14" name="image11.jpg"/>
             <a:graphic>
               <a:graphicData uri="http://schemas.openxmlformats.org/drawingml/2006/picture">
                 <pic:pic>
                   <pic:nvPicPr>
-                    <pic:cNvPr id="0" name="image7.jpg"/>
+                    <pic:cNvPr id="0" name="image11.jpg"/>
                     <pic:cNvPicPr preferRelativeResize="0"/>
                   </pic:nvPicPr>
                   <pic:blipFill>
@@ -4837,12 +5224,12 @@
           <wp:inline distB="0" distT="0" distL="0" distR="0">
             <wp:extent cx="1943004" cy="1092940"/>
             <wp:effectExtent b="0" l="0" r="0" t="0"/>
-            <wp:docPr id="15" name="image3.jpg"/>
+            <wp:docPr id="15" name="image8.jpg"/>
             <a:graphic>
               <a:graphicData uri="http://schemas.openxmlformats.org/drawingml/2006/picture">
                 <pic:pic>
                   <pic:nvPicPr>
-                    <pic:cNvPr id="0" name="image3.jpg"/>
+                    <pic:cNvPr id="0" name="image8.jpg"/>
                     <pic:cNvPicPr preferRelativeResize="0"/>
                   </pic:nvPicPr>
                   <pic:blipFill>
@@ -4982,12 +5369,12 @@
           <wp:inline distB="0" distT="0" distL="0" distR="0">
             <wp:extent cx="2475136" cy="1392264"/>
             <wp:effectExtent b="0" l="0" r="0" t="0"/>
-            <wp:docPr id="17" name="image23.jpg"/>
+            <wp:docPr id="17" name="image5.jpg"/>
             <a:graphic>
               <a:graphicData uri="http://schemas.openxmlformats.org/drawingml/2006/picture">
                 <pic:pic>
                   <pic:nvPicPr>
-                    <pic:cNvPr id="0" name="image23.jpg"/>
+                    <pic:cNvPr id="0" name="image5.jpg"/>
                     <pic:cNvPicPr preferRelativeResize="0"/>
                   </pic:nvPicPr>
                   <pic:blipFill>
@@ -5070,12 +5457,12 @@
           <wp:inline distB="0" distT="0" distL="0" distR="0">
             <wp:extent cx="2013258" cy="1132457"/>
             <wp:effectExtent b="0" l="0" r="0" t="0"/>
-            <wp:docPr id="18" name="image31.jpg"/>
+            <wp:docPr id="18" name="image4.jpg"/>
             <a:graphic>
               <a:graphicData uri="http://schemas.openxmlformats.org/drawingml/2006/picture">
                 <pic:pic>
                   <pic:nvPicPr>
-                    <pic:cNvPr id="0" name="image31.jpg"/>
+                    <pic:cNvPr id="0" name="image4.jpg"/>
                     <pic:cNvPicPr preferRelativeResize="0"/>
                   </pic:nvPicPr>
                   <pic:blipFill>
@@ -5138,12 +5525,12 @@
           <wp:inline distB="0" distT="0" distL="0" distR="0">
             <wp:extent cx="2009902" cy="1130570"/>
             <wp:effectExtent b="0" l="0" r="0" t="0"/>
-            <wp:docPr id="1" name="image8.jpg"/>
+            <wp:docPr id="1" name="image9.jpg"/>
             <a:graphic>
               <a:graphicData uri="http://schemas.openxmlformats.org/drawingml/2006/picture">
                 <pic:pic>
                   <pic:nvPicPr>
-                    <pic:cNvPr id="0" name="image8.jpg"/>
+                    <pic:cNvPr id="0" name="image9.jpg"/>
                     <pic:cNvPicPr preferRelativeResize="0"/>
                   </pic:nvPicPr>
                   <pic:blipFill>
@@ -5359,12 +5746,12 @@
           <wp:inline distB="0" distT="0" distL="0" distR="0">
             <wp:extent cx="2475136" cy="1392264"/>
             <wp:effectExtent b="0" l="0" r="0" t="0"/>
-            <wp:docPr id="3" name="image1.jpg"/>
+            <wp:docPr id="3" name="image15.jpg"/>
             <a:graphic>
               <a:graphicData uri="http://schemas.openxmlformats.org/drawingml/2006/picture">
                 <pic:pic>
                   <pic:nvPicPr>
-                    <pic:cNvPr id="0" name="image1.jpg"/>
+                    <pic:cNvPr id="0" name="image15.jpg"/>
                     <pic:cNvPicPr preferRelativeResize="0"/>
                   </pic:nvPicPr>
                   <pic:blipFill>

</xml_diff>